<commit_message>
Update 545_Final_Report.docx revised from feedback
</commit_message>
<xml_diff>
--- a/545_Final_Report.docx
+++ b/545_Final_Report.docx
@@ -12,20 +12,32 @@
         <w:rPr>
           <w:rFonts w:asciiTheme="minorHAnsi" w:hAnsiTheme="minorHAnsi" w:cstheme="minorHAnsi"/>
         </w:rPr>
-        <w:t>Term Project - Final Draft</w:t>
-      </w:r>
-    </w:p>
-    <w:p>
-      <w:pPr>
-        <w:rPr>
-          <w:rFonts w:asciiTheme="minorHAnsi" w:hAnsiTheme="minorHAnsi" w:cstheme="minorHAnsi"/>
-        </w:rPr>
-      </w:pPr>
-      <w:r>
-        <w:rPr>
-          <w:rFonts w:asciiTheme="minorHAnsi" w:hAnsiTheme="minorHAnsi" w:cstheme="minorHAnsi"/>
-        </w:rPr>
-        <w:t>Feb 27, 2026</w:t>
+        <w:t xml:space="preserve">Term Project - Final </w:t>
+      </w:r>
+      <w:r>
+        <w:rPr>
+          <w:rFonts w:asciiTheme="minorHAnsi" w:hAnsiTheme="minorHAnsi" w:cstheme="minorHAnsi"/>
+        </w:rPr>
+        <w:t>Report</w:t>
+      </w:r>
+    </w:p>
+    <w:p>
+      <w:pPr>
+        <w:rPr>
+          <w:rFonts w:asciiTheme="minorHAnsi" w:hAnsiTheme="minorHAnsi" w:cstheme="minorHAnsi"/>
+        </w:rPr>
+      </w:pPr>
+      <w:r>
+        <w:rPr>
+          <w:rFonts w:asciiTheme="minorHAnsi" w:hAnsiTheme="minorHAnsi" w:cstheme="minorHAnsi"/>
+        </w:rPr>
+        <w:t>Mar 17</w:t>
+      </w:r>
+      <w:r>
+        <w:rPr>
+          <w:rFonts w:asciiTheme="minorHAnsi" w:hAnsiTheme="minorHAnsi" w:cstheme="minorHAnsi"/>
+        </w:rPr>
+        <w:t>, 2026</w:t>
       </w:r>
     </w:p>
     <w:p>
@@ -66,14 +78,39 @@
         <w:rPr>
           <w:rFonts w:asciiTheme="minorHAnsi" w:hAnsiTheme="minorHAnsi" w:cstheme="minorHAnsi"/>
         </w:rPr>
-        <w:t xml:space="preserve">- Recommended data citation: </w:t>
-      </w:r>
+        <w:t xml:space="preserve">- </w:t>
+      </w:r>
+      <w:r>
+        <w:rPr>
+          <w:rFonts w:asciiTheme="minorHAnsi" w:hAnsiTheme="minorHAnsi" w:cstheme="minorHAnsi"/>
+          <w:b/>
+          <w:bCs/>
+        </w:rPr>
+        <w:t xml:space="preserve">Recommended data citation: </w:t>
+      </w:r>
+    </w:p>
+    <w:p>
+      <w:pPr>
+        <w:spacing w:line="360" w:lineRule="auto"/>
+        <w:rPr>
+          <w:rFonts w:asciiTheme="minorHAnsi" w:hAnsiTheme="minorHAnsi" w:cstheme="minorHAnsi"/>
+        </w:rPr>
+      </w:pPr>
       <w:r>
         <w:rPr>
           <w:rStyle w:val="Strong"/>
           <w:rFonts w:asciiTheme="minorHAnsi" w:hAnsiTheme="minorHAnsi" w:cstheme="minorHAnsi"/>
-        </w:rPr>
-        <w:t>City of Seattle Department of Transportation (SDOT),</w:t>
+          <w:b w:val="0"/>
+          <w:bCs w:val="0"/>
+        </w:rPr>
+        <w:t>City of Seattle Department of Transportation (SDOT)</w:t>
+      </w:r>
+      <w:r>
+        <w:rPr>
+          <w:rStyle w:val="Strong"/>
+          <w:rFonts w:asciiTheme="minorHAnsi" w:hAnsiTheme="minorHAnsi" w:cstheme="minorHAnsi"/>
+        </w:rPr>
+        <w:t>,</w:t>
       </w:r>
       <w:r>
         <w:rPr>
@@ -94,7 +131,7 @@
         </w:rPr>
         <w:t xml:space="preserve"> [Data set]. Version updated February 2026. Seattle Open Data Portal. Retrieved from </w:t>
       </w:r>
-      <w:hyperlink r:id="rId4" w:tgtFrame="_blank" w:history="1">
+      <w:hyperlink r:id="rId5" w:tgtFrame="_blank" w:history="1">
         <w:r>
           <w:rPr>
             <w:rStyle w:val="text-box-trim-both"/>
@@ -123,12 +160,6 @@
       </w:pPr>
       <w:r>
         <w:rPr>
-          <w:rFonts w:asciiTheme="minorHAnsi" w:hAnsiTheme="minorHAnsi" w:cstheme="minorHAnsi"/>
-        </w:rPr>
-        <w:t xml:space="preserve">- </w:t>
-      </w:r>
-      <w:r>
-        <w:rPr>
           <w:rStyle w:val="Strong"/>
           <w:rFonts w:asciiTheme="minorHAnsi" w:hAnsiTheme="minorHAnsi" w:cstheme="minorHAnsi"/>
           <w:b w:val="0"/>
@@ -224,7 +255,7 @@
           <w:rFonts w:asciiTheme="minorHAnsi" w:hAnsiTheme="minorHAnsi" w:cstheme="minorHAnsi"/>
         </w:rPr>
         <w:noBreakHyphen/>
-        <w:t>proprietary, stable format such as CSV or GeoPackage, plus XML/JSON metadata and checksum files.</w:t>
+        <w:t>proprietary, stable format such as CSV or GeoPackage, plus XML metadata and checksum files.</w:t>
       </w:r>
     </w:p>
     <w:p>
@@ -242,7 +273,7 @@
           <w:b w:val="0"/>
           <w:bCs w:val="0"/>
         </w:rPr>
-        <w:t>Sustainability measure:</w:t>
+        <w:t>Sustainability:</w:t>
       </w:r>
       <w:r>
         <w:rPr>
@@ -256,128 +287,148 @@
         <w:rPr>
           <w:rFonts w:asciiTheme="minorHAnsi" w:hAnsiTheme="minorHAnsi" w:cstheme="minorHAnsi"/>
         </w:rPr>
-        <w:t>Maintain dual availability—City of Seattle Open Data (ongoing updates) and a static reference version archived within NOAA NCEI or Zenodo for citation stability.</w:t>
-      </w:r>
-    </w:p>
-    <w:p>
-      <w:pPr>
-        <w:rPr>
-          <w:rFonts w:asciiTheme="minorHAnsi" w:hAnsiTheme="minorHAnsi" w:cstheme="minorHAnsi"/>
-        </w:rPr>
-      </w:pPr>
-    </w:p>
-    <w:p>
-      <w:pPr>
-        <w:rPr>
-          <w:rFonts w:asciiTheme="minorHAnsi" w:hAnsiTheme="minorHAnsi" w:cstheme="minorHAnsi"/>
-        </w:rPr>
-      </w:pPr>
-      <w:r>
-        <w:rPr>
-          <w:rFonts w:asciiTheme="minorHAnsi" w:hAnsiTheme="minorHAnsi" w:cstheme="minorHAnsi"/>
-        </w:rPr>
-        <w:t xml:space="preserve">  - This dataset does not contain any personally identifiable information or data related to human subjects. No human subject considerations apply, and no steps for anonymization or privacy protection were necessary.</w:t>
-      </w:r>
-    </w:p>
-    <w:p>
-      <w:pPr>
-        <w:rPr>
-          <w:rFonts w:asciiTheme="minorHAnsi" w:hAnsiTheme="minorHAnsi" w:cstheme="minorHAnsi"/>
-        </w:rPr>
-      </w:pPr>
-    </w:p>
-    <w:p>
-      <w:pPr>
-        <w:rPr>
-          <w:rFonts w:asciiTheme="minorHAnsi" w:hAnsiTheme="minorHAnsi" w:cstheme="minorHAnsi"/>
-        </w:rPr>
-      </w:pPr>
-    </w:p>
-    <w:p>
-      <w:pPr>
-        <w:rPr>
-          <w:rFonts w:cstheme="minorHAnsi"/>
-        </w:rPr>
-      </w:pPr>
-    </w:p>
-    <w:p>
-      <w:pPr>
-        <w:rPr>
-          <w:rFonts w:cstheme="minorHAnsi"/>
-        </w:rPr>
-      </w:pPr>
-      <w:r>
-        <w:rPr>
-          <w:rFonts w:cstheme="minorHAnsi"/>
-        </w:rPr>
-        <w:t>Term Project - Data and Metadata Profile</w:t>
-      </w:r>
-    </w:p>
-    <w:p>
-      <w:pPr>
-        <w:rPr>
-          <w:rFonts w:cstheme="minorHAnsi"/>
-        </w:rPr>
-      </w:pPr>
-      <w:r>
-        <w:rPr>
-          <w:rFonts w:cstheme="minorHAnsi"/>
-        </w:rPr>
-        <w:t>Feb 27</w:t>
-      </w:r>
-      <w:r>
-        <w:rPr>
-          <w:rFonts w:cstheme="minorHAnsi"/>
-        </w:rPr>
-        <w:t>, 2026</w:t>
-      </w:r>
-      <w:r>
-        <w:rPr>
-          <w:rFonts w:cstheme="minorHAnsi"/>
-        </w:rPr>
-        <w:t xml:space="preserve"> update</w:t>
-      </w:r>
-    </w:p>
-    <w:p>
-      <w:pPr>
-        <w:rPr>
-          <w:rFonts w:cstheme="minorHAnsi"/>
-        </w:rPr>
-      </w:pPr>
-    </w:p>
-    <w:p>
-      <w:pPr>
-        <w:spacing w:line="360" w:lineRule="auto"/>
-        <w:ind w:right="-90"/>
-        <w:rPr>
-          <w:rStyle w:val="Strong"/>
-          <w:rFonts w:cstheme="minorHAnsi"/>
-        </w:rPr>
-      </w:pPr>
-      <w:r>
-        <w:rPr>
-          <w:rStyle w:val="Strong"/>
-          <w:rFonts w:cstheme="minorHAnsi"/>
-        </w:rPr>
-        <w:t>Seattle Combined Tree Point Dataset</w:t>
-      </w:r>
-    </w:p>
-    <w:p>
-      <w:pPr>
-        <w:spacing w:line="360" w:lineRule="auto"/>
-        <w:ind w:right="-90"/>
-        <w:rPr>
-          <w:rFonts w:cstheme="minorHAnsi"/>
+        <w:t>Maintain dual availability—City of Seattle Open Data (ongoing updates) and a static version archived within NOAA NCEI</w:t>
+      </w:r>
+      <w:r>
+        <w:rPr>
+          <w:rFonts w:asciiTheme="minorHAnsi" w:hAnsiTheme="minorHAnsi" w:cstheme="minorHAnsi"/>
+        </w:rPr>
+        <w:t xml:space="preserve"> </w:t>
+      </w:r>
+      <w:r>
+        <w:rPr>
+          <w:rFonts w:asciiTheme="minorHAnsi" w:hAnsiTheme="minorHAnsi" w:cstheme="minorHAnsi"/>
+        </w:rPr>
+        <w:t>for citation stability.</w:t>
+      </w:r>
+    </w:p>
+    <w:p>
+      <w:pPr>
+        <w:rPr>
+          <w:rFonts w:asciiTheme="minorHAnsi" w:hAnsiTheme="minorHAnsi" w:cstheme="minorHAnsi"/>
+        </w:rPr>
+      </w:pPr>
+    </w:p>
+    <w:p>
+      <w:pPr>
+        <w:rPr>
+          <w:rFonts w:asciiTheme="minorHAnsi" w:hAnsiTheme="minorHAnsi" w:cstheme="minorHAnsi"/>
+        </w:rPr>
+      </w:pPr>
+      <w:r>
+        <w:rPr>
+          <w:rFonts w:asciiTheme="minorHAnsi" w:hAnsiTheme="minorHAnsi" w:cstheme="minorHAnsi"/>
           <w:b/>
           <w:bCs/>
         </w:rPr>
-      </w:pPr>
-      <w:r>
+        <w:t>This dataset does not contain any personally identifiable information</w:t>
+      </w:r>
+      <w:r>
+        <w:rPr>
+          <w:rFonts w:asciiTheme="minorHAnsi" w:hAnsiTheme="minorHAnsi" w:cstheme="minorHAnsi"/>
+        </w:rPr>
+        <w:t xml:space="preserve"> or data related to human subjects. No human subject considerations apply, and no steps for anonymization or privacy protection were necessary.</w:t>
+      </w:r>
+    </w:p>
+    <w:p>
+      <w:pPr>
+        <w:rPr>
+          <w:rFonts w:asciiTheme="minorHAnsi" w:hAnsiTheme="minorHAnsi" w:cstheme="minorHAnsi"/>
+        </w:rPr>
+      </w:pPr>
+    </w:p>
+    <w:p>
+      <w:pPr>
+        <w:rPr>
+          <w:rFonts w:asciiTheme="minorHAnsi" w:hAnsiTheme="minorHAnsi" w:cstheme="minorHAnsi"/>
+        </w:rPr>
+      </w:pPr>
+    </w:p>
+    <w:p>
+      <w:pPr>
+        <w:rPr>
+          <w:rFonts w:cstheme="minorHAnsi"/>
+        </w:rPr>
+      </w:pPr>
+    </w:p>
+    <w:p>
+      <w:pPr>
+        <w:rPr>
+          <w:rFonts w:cstheme="minorHAnsi"/>
+        </w:rPr>
+      </w:pPr>
+      <w:r>
+        <w:rPr>
+          <w:rFonts w:cstheme="minorHAnsi"/>
+        </w:rPr>
+        <w:t>Term Project - Data and Metadata Profile</w:t>
+      </w:r>
+    </w:p>
+    <w:p>
+      <w:pPr>
+        <w:rPr>
+          <w:rFonts w:cstheme="minorHAnsi"/>
+        </w:rPr>
+      </w:pPr>
+      <w:r>
+        <w:rPr>
+          <w:rFonts w:cstheme="minorHAnsi"/>
+        </w:rPr>
+        <w:t>Feb 27</w:t>
+      </w:r>
+      <w:r>
+        <w:rPr>
+          <w:rFonts w:cstheme="minorHAnsi"/>
+        </w:rPr>
+        <w:t>, 2026</w:t>
+      </w:r>
+      <w:r>
+        <w:rPr>
+          <w:rFonts w:cstheme="minorHAnsi"/>
+        </w:rPr>
+        <w:t xml:space="preserve"> update</w:t>
+      </w:r>
+    </w:p>
+    <w:p>
+      <w:pPr>
+        <w:rPr>
+          <w:rFonts w:cstheme="minorHAnsi"/>
+        </w:rPr>
+      </w:pPr>
+    </w:p>
+    <w:p>
+      <w:pPr>
+        <w:spacing w:line="360" w:lineRule="auto"/>
+        <w:ind w:right="-90"/>
+        <w:rPr>
+          <w:rStyle w:val="Strong"/>
+          <w:rFonts w:cstheme="minorHAnsi"/>
+        </w:rPr>
+      </w:pPr>
+      <w:r>
+        <w:rPr>
+          <w:rStyle w:val="Strong"/>
+          <w:rFonts w:cstheme="minorHAnsi"/>
+        </w:rPr>
+        <w:t>Seattle Combined Tree Point Dataset</w:t>
+      </w:r>
+    </w:p>
+    <w:p>
+      <w:pPr>
+        <w:spacing w:line="360" w:lineRule="auto"/>
+        <w:ind w:right="-90"/>
         <w:rPr>
           <w:rFonts w:cstheme="minorHAnsi"/>
           <w:b/>
           <w:bCs/>
         </w:rPr>
+      </w:pPr>
+      <w:r>
+        <w:rPr>
+          <w:rFonts w:cstheme="minorHAnsi"/>
+          <w:b/>
+          <w:bCs/>
+        </w:rPr>
         <w:t>Origin: SDOT Trees</w:t>
       </w:r>
     </w:p>
@@ -390,27 +441,13 @@
           <w:rFonts w:cstheme="minorHAnsi"/>
         </w:rPr>
       </w:pPr>
-      <w:hyperlink r:id="rId5" w:history="1">
+      <w:hyperlink r:id="rId6" w:history="1">
         <w:r>
           <w:rPr>
             <w:rStyle w:val="Hyperlink"/>
             <w:rFonts w:cstheme="minorHAnsi"/>
           </w:rPr>
-          <w:t>https://data-seattle</w:t>
-        </w:r>
-        <w:r>
-          <w:rPr>
-            <w:rStyle w:val="Hyperlink"/>
-            <w:rFonts w:cstheme="minorHAnsi"/>
-          </w:rPr>
-          <w:t>c</w:t>
-        </w:r>
-        <w:r>
-          <w:rPr>
-            <w:rStyle w:val="Hyperlink"/>
-            <w:rFonts w:cstheme="minorHAnsi"/>
-          </w:rPr>
-          <w:t>itygis.opendata.arcgis.com/datasets/db783659194f47ef8fbd8e010c102809_0/explore?showTable=true</w:t>
+          <w:t>https://data-seattlecitygis.opendata.arcgis.com/datasets/db783659194f47ef8fbd8e010c102809_0/explore?showTable=true</w:t>
         </w:r>
       </w:hyperlink>
     </w:p>
@@ -447,7 +484,7 @@
           <w:rFonts w:cstheme="minorHAnsi"/>
         </w:rPr>
       </w:pPr>
-      <w:hyperlink r:id="rId6" w:history="1">
+      <w:hyperlink r:id="rId7" w:history="1">
         <w:r>
           <w:rPr>
             <w:rStyle w:val="Hyperlink"/>
@@ -482,7 +519,20 @@
         <w:rPr>
           <w:rFonts w:cstheme="minorHAnsi"/>
         </w:rPr>
-        <w:t xml:space="preserve">The Seattle Combined Tree Point dataset provides geospatial point data on trees across Seattle, combining inventories from multiple city departments. It supports urban forestry analysis, for enviromental planning and applications such as walkability scores when considering urban heat maps and green canopies. </w:t>
+        <w:lastRenderedPageBreak/>
+        <w:t xml:space="preserve">The Seattle Combined Tree Point dataset provides geospatial point data on trees across Seattle, combining inventories from multiple city departments. It supports urban forestry analysis, for </w:t>
+      </w:r>
+      <w:r>
+        <w:rPr>
+          <w:rFonts w:cstheme="minorHAnsi"/>
+        </w:rPr>
+        <w:t>environmental</w:t>
+      </w:r>
+      <w:r>
+        <w:rPr>
+          <w:rFonts w:cstheme="minorHAnsi"/>
+        </w:rPr>
+        <w:t xml:space="preserve"> planning and applications such as walkability scores when considering urban heat maps and green canopies. </w:t>
       </w:r>
     </w:p>
     <w:p>
@@ -522,7 +572,31 @@
         <w:rPr>
           <w:rFonts w:asciiTheme="minorHAnsi" w:hAnsiTheme="minorHAnsi" w:cstheme="minorHAnsi"/>
         </w:rPr>
-        <w:t>The data consist of individual tree locations with attributes like species, diameter, condition, maintenance responsibility, and spatial coordinates. These points represent street trees, park trees, utility corridor trees, and others in Seattle's public right-of-way and managed lands.</w:t>
+        <w:t xml:space="preserve">The data consist of individual tree locations with attributes like species, diameter, maintenance responsibility, </w:t>
+      </w:r>
+      <w:r>
+        <w:rPr>
+          <w:rFonts w:asciiTheme="minorHAnsi" w:hAnsiTheme="minorHAnsi" w:cstheme="minorHAnsi"/>
+        </w:rPr>
+        <w:t xml:space="preserve">date planted, date removed, </w:t>
+      </w:r>
+      <w:r>
+        <w:rPr>
+          <w:rFonts w:asciiTheme="minorHAnsi" w:hAnsiTheme="minorHAnsi" w:cstheme="minorHAnsi"/>
+        </w:rPr>
+        <w:t>condition,</w:t>
+      </w:r>
+      <w:r>
+        <w:rPr>
+          <w:rFonts w:asciiTheme="minorHAnsi" w:hAnsiTheme="minorHAnsi" w:cstheme="minorHAnsi"/>
+        </w:rPr>
+        <w:t xml:space="preserve"> </w:t>
+      </w:r>
+      <w:r>
+        <w:rPr>
+          <w:rFonts w:asciiTheme="minorHAnsi" w:hAnsiTheme="minorHAnsi" w:cstheme="minorHAnsi"/>
+        </w:rPr>
+        <w:t>and spatial coordinates. These points represent street trees, park trees, utility corridor trees, and others in Seattle's public right-of-way and managed lands.</w:t>
       </w:r>
     </w:p>
     <w:p>
@@ -621,13 +695,33 @@
           <w:rStyle w:val="inline-flex"/>
           <w:rFonts w:asciiTheme="minorHAnsi" w:hAnsiTheme="minorHAnsi" w:cstheme="minorHAnsi"/>
         </w:rPr>
-        <w:t>​ Some people would like to encorporate the dataset into a walkabiity app (ILovePedestrians, 2025).</w:t>
-      </w:r>
-      <w:r>
-        <w:rPr>
-          <w:rFonts w:asciiTheme="minorHAnsi" w:hAnsiTheme="minorHAnsi" w:cstheme="minorHAnsi"/>
-        </w:rPr>
-        <w:t xml:space="preserve"> Funders and managers are the City of Seattle Open Data Program</w:t>
+        <w:t>​ Some people would like to incorporate the dataset into a walkabi</w:t>
+      </w:r>
+      <w:r>
+        <w:rPr>
+          <w:rStyle w:val="inline-flex"/>
+          <w:rFonts w:asciiTheme="minorHAnsi" w:hAnsiTheme="minorHAnsi" w:cstheme="minorHAnsi"/>
+        </w:rPr>
+        <w:t>l</w:t>
+      </w:r>
+      <w:r>
+        <w:rPr>
+          <w:rStyle w:val="inline-flex"/>
+          <w:rFonts w:asciiTheme="minorHAnsi" w:hAnsiTheme="minorHAnsi" w:cstheme="minorHAnsi"/>
+        </w:rPr>
+        <w:t>ity app (ILovePedestrians, 2025).</w:t>
+      </w:r>
+      <w:r>
+        <w:rPr>
+          <w:rFonts w:asciiTheme="minorHAnsi" w:hAnsiTheme="minorHAnsi" w:cstheme="minorHAnsi"/>
+        </w:rPr>
+        <w:t xml:space="preserve"> </w:t>
+      </w:r>
+      <w:r>
+        <w:rPr>
+          <w:rFonts w:asciiTheme="minorHAnsi" w:hAnsiTheme="minorHAnsi" w:cstheme="minorHAnsi"/>
+        </w:rPr>
+        <w:t>Funders and managers are the City of Seattle Open Data Program</w:t>
       </w:r>
       <w:r>
         <w:rPr>
@@ -1148,19 +1242,224 @@
     </w:p>
     <w:p>
       <w:pPr>
-        <w:pStyle w:val="my-2"/>
-        <w:spacing w:line="360" w:lineRule="auto"/>
-        <w:rPr>
-          <w:rFonts w:asciiTheme="minorHAnsi" w:hAnsiTheme="minorHAnsi" w:cstheme="minorHAnsi"/>
-          <w:color w:val="000000" w:themeColor="text1"/>
-        </w:rPr>
-      </w:pPr>
-      <w:r>
-        <w:rPr>
-          <w:rFonts w:asciiTheme="minorHAnsi" w:hAnsiTheme="minorHAnsi" w:cstheme="minorHAnsi"/>
-          <w:color w:val="000000" w:themeColor="text1"/>
-        </w:rPr>
-        <w:t>To improve discoverability, I added LCSH keywords (e.g., Urban forestry," "Street trees," "Pacific Northwest Region"), temporal coverage after checking that it is last updating in February 2026 (weekly updates since ~2020-2026). I used DataCite metadata standard for better search results in repositories (DataONE, n.d.).</w:t>
+        <w:spacing w:line="360" w:lineRule="auto"/>
+      </w:pPr>
+      <w:r>
+        <w:rPr>
+          <w:rFonts w:asciiTheme="minorHAnsi" w:hAnsiTheme="minorHAnsi" w:cstheme="minorHAnsi"/>
+          <w:color w:val="000000" w:themeColor="text1"/>
+        </w:rPr>
+        <w:t xml:space="preserve">To improve discoverability, I added LCSH </w:t>
+      </w:r>
+      <w:r>
+        <w:rPr>
+          <w:rFonts w:asciiTheme="minorHAnsi" w:hAnsiTheme="minorHAnsi" w:cstheme="minorHAnsi"/>
+          <w:color w:val="000000" w:themeColor="text1"/>
+        </w:rPr>
+        <w:t>t</w:t>
+      </w:r>
+      <w:r>
+        <w:rPr>
+          <w:rFonts w:asciiTheme="minorHAnsi" w:hAnsiTheme="minorHAnsi" w:cstheme="minorHAnsi"/>
+          <w:color w:val="000000" w:themeColor="text1"/>
+        </w:rPr>
+        <w:t>opics</w:t>
+      </w:r>
+      <w:r>
+        <w:rPr>
+          <w:rFonts w:asciiTheme="minorHAnsi" w:hAnsiTheme="minorHAnsi" w:cstheme="minorHAnsi"/>
+          <w:color w:val="000000" w:themeColor="text1"/>
+        </w:rPr>
+        <w:t xml:space="preserve"> ("Street trees,"</w:t>
+      </w:r>
+      <w:r>
+        <w:rPr>
+          <w:rFonts w:asciiTheme="minorHAnsi" w:hAnsiTheme="minorHAnsi" w:cstheme="minorHAnsi"/>
+          <w:color w:val="000000" w:themeColor="text1"/>
+        </w:rPr>
+        <w:t xml:space="preserve"> "Trees in </w:t>
+      </w:r>
+      <w:r>
+        <w:rPr>
+          <w:rFonts w:asciiTheme="minorHAnsi" w:hAnsiTheme="minorHAnsi" w:cstheme="minorHAnsi"/>
+          <w:color w:val="000000" w:themeColor="text1"/>
+        </w:rPr>
+        <w:t>c</w:t>
+      </w:r>
+      <w:r>
+        <w:rPr>
+          <w:rFonts w:asciiTheme="minorHAnsi" w:hAnsiTheme="minorHAnsi" w:cstheme="minorHAnsi"/>
+          <w:color w:val="000000" w:themeColor="text1"/>
+        </w:rPr>
+        <w:t>ities</w:t>
+      </w:r>
+      <w:r>
+        <w:rPr>
+          <w:rFonts w:asciiTheme="minorHAnsi" w:hAnsiTheme="minorHAnsi" w:cstheme="minorHAnsi"/>
+          <w:color w:val="000000" w:themeColor="text1"/>
+        </w:rPr>
+        <w:t>,</w:t>
+      </w:r>
+      <w:r>
+        <w:rPr>
+          <w:rFonts w:asciiTheme="minorHAnsi" w:hAnsiTheme="minorHAnsi" w:cstheme="minorHAnsi"/>
+          <w:color w:val="000000" w:themeColor="text1"/>
+        </w:rPr>
+        <w:t>"</w:t>
+      </w:r>
+      <w:r>
+        <w:rPr>
+          <w:rFonts w:asciiTheme="minorHAnsi" w:hAnsiTheme="minorHAnsi" w:cstheme="minorHAnsi"/>
+          <w:color w:val="000000" w:themeColor="text1"/>
+        </w:rPr>
+        <w:t xml:space="preserve"> </w:t>
+      </w:r>
+      <w:r>
+        <w:rPr>
+          <w:rFonts w:asciiTheme="minorHAnsi" w:hAnsiTheme="minorHAnsi" w:cstheme="minorHAnsi"/>
+          <w:color w:val="000000" w:themeColor="text1"/>
+        </w:rPr>
+        <w:t>"Urban forestry,"</w:t>
+      </w:r>
+      <w:r>
+        <w:rPr>
+          <w:rFonts w:asciiTheme="minorHAnsi" w:hAnsiTheme="minorHAnsi" w:cstheme="minorHAnsi"/>
+          <w:color w:val="000000" w:themeColor="text1"/>
+        </w:rPr>
+        <w:t xml:space="preserve"> </w:t>
+      </w:r>
+      <w:r>
+        <w:rPr>
+          <w:rFonts w:asciiTheme="minorHAnsi" w:hAnsiTheme="minorHAnsi" w:cstheme="minorHAnsi"/>
+          <w:color w:val="000000" w:themeColor="text1"/>
+        </w:rPr>
+        <w:t>"Arboriculture</w:t>
+      </w:r>
+      <w:r>
+        <w:rPr>
+          <w:rFonts w:asciiTheme="minorHAnsi" w:hAnsiTheme="minorHAnsi" w:cstheme="minorHAnsi"/>
+          <w:color w:val="000000" w:themeColor="text1"/>
+        </w:rPr>
+        <w:t>,</w:t>
+      </w:r>
+      <w:r>
+        <w:rPr>
+          <w:rFonts w:asciiTheme="minorHAnsi" w:hAnsiTheme="minorHAnsi" w:cstheme="minorHAnsi"/>
+          <w:color w:val="000000" w:themeColor="text1"/>
+        </w:rPr>
+        <w:t>"</w:t>
+      </w:r>
+      <w:r>
+        <w:rPr>
+          <w:rFonts w:asciiTheme="minorHAnsi" w:hAnsiTheme="minorHAnsi" w:cstheme="minorHAnsi"/>
+          <w:color w:val="000000" w:themeColor="text1"/>
+        </w:rPr>
+        <w:t xml:space="preserve"> </w:t>
+      </w:r>
+      <w:r>
+        <w:rPr>
+          <w:rFonts w:asciiTheme="minorHAnsi" w:hAnsiTheme="minorHAnsi" w:cstheme="minorHAnsi"/>
+          <w:color w:val="000000" w:themeColor="text1"/>
+        </w:rPr>
+        <w:t>"Green tree retention</w:t>
+      </w:r>
+      <w:r>
+        <w:rPr>
+          <w:rFonts w:asciiTheme="minorHAnsi" w:hAnsiTheme="minorHAnsi" w:cstheme="minorHAnsi"/>
+          <w:color w:val="000000" w:themeColor="text1"/>
+        </w:rPr>
+        <w:t>,</w:t>
+      </w:r>
+      <w:r>
+        <w:rPr>
+          <w:rFonts w:asciiTheme="minorHAnsi" w:hAnsiTheme="minorHAnsi" w:cstheme="minorHAnsi"/>
+          <w:color w:val="000000" w:themeColor="text1"/>
+        </w:rPr>
+        <w:t>" "Green movement</w:t>
+      </w:r>
+      <w:r>
+        <w:rPr>
+          <w:rFonts w:asciiTheme="minorHAnsi" w:hAnsiTheme="minorHAnsi" w:cstheme="minorHAnsi"/>
+          <w:color w:val="000000" w:themeColor="text1"/>
+        </w:rPr>
+        <w:t>,</w:t>
+      </w:r>
+      <w:r>
+        <w:rPr>
+          <w:rFonts w:asciiTheme="minorHAnsi" w:hAnsiTheme="minorHAnsi" w:cstheme="minorHAnsi"/>
+          <w:color w:val="000000" w:themeColor="text1"/>
+        </w:rPr>
+        <w:t>"</w:t>
+      </w:r>
+      <w:r>
+        <w:rPr>
+          <w:rFonts w:asciiTheme="minorHAnsi" w:hAnsiTheme="minorHAnsi" w:cstheme="minorHAnsi"/>
+          <w:color w:val="000000" w:themeColor="text1"/>
+        </w:rPr>
+        <w:t xml:space="preserve"> </w:t>
+      </w:r>
+      <w:r>
+        <w:rPr>
+          <w:rFonts w:asciiTheme="minorHAnsi" w:hAnsiTheme="minorHAnsi" w:cstheme="minorHAnsi"/>
+          <w:color w:val="000000" w:themeColor="text1"/>
+        </w:rPr>
+        <w:t>"Seattle, Wash.</w:t>
+      </w:r>
+      <w:r>
+        <w:rPr>
+          <w:rFonts w:asciiTheme="minorHAnsi" w:hAnsiTheme="minorHAnsi" w:cstheme="minorHAnsi"/>
+          <w:color w:val="000000" w:themeColor="text1"/>
+        </w:rPr>
+        <w:t>,</w:t>
+      </w:r>
+      <w:r>
+        <w:rPr>
+          <w:rFonts w:asciiTheme="minorHAnsi" w:hAnsiTheme="minorHAnsi" w:cstheme="minorHAnsi"/>
+          <w:color w:val="000000" w:themeColor="text1"/>
+        </w:rPr>
+        <w:t xml:space="preserve">" </w:t>
+      </w:r>
+      <w:r>
+        <w:rPr>
+          <w:rFonts w:asciiTheme="minorHAnsi" w:hAnsiTheme="minorHAnsi" w:cstheme="minorHAnsi"/>
+          <w:color w:val="000000" w:themeColor="text1"/>
+        </w:rPr>
+        <w:t xml:space="preserve">and </w:t>
+      </w:r>
+      <w:r>
+        <w:rPr>
+          <w:rFonts w:asciiTheme="minorHAnsi" w:hAnsiTheme="minorHAnsi" w:cstheme="minorHAnsi"/>
+          <w:color w:val="000000" w:themeColor="text1"/>
+        </w:rPr>
+        <w:t>"Northwest, Pacific"</w:t>
+      </w:r>
+      <w:r>
+        <w:rPr>
+          <w:rFonts w:asciiTheme="minorHAnsi" w:hAnsiTheme="minorHAnsi" w:cstheme="minorHAnsi"/>
+          <w:color w:val="000000" w:themeColor="text1"/>
+        </w:rPr>
+        <w:t>)</w:t>
+      </w:r>
+      <w:r>
+        <w:rPr>
+          <w:rFonts w:asciiTheme="minorHAnsi" w:hAnsiTheme="minorHAnsi" w:cstheme="minorHAnsi"/>
+          <w:color w:val="000000" w:themeColor="text1"/>
+        </w:rPr>
+        <w:t>,</w:t>
+      </w:r>
+      <w:r>
+        <w:rPr>
+          <w:rFonts w:asciiTheme="minorHAnsi" w:hAnsiTheme="minorHAnsi" w:cstheme="minorHAnsi"/>
+          <w:color w:val="000000" w:themeColor="text1"/>
+        </w:rPr>
+        <w:t xml:space="preserve"> and </w:t>
+      </w:r>
+      <w:r>
+        <w:rPr>
+          <w:rFonts w:asciiTheme="minorHAnsi" w:hAnsiTheme="minorHAnsi" w:cstheme="minorHAnsi"/>
+          <w:color w:val="000000" w:themeColor="text1"/>
+        </w:rPr>
+        <w:t xml:space="preserve"> temporal coverage after checking that it is last updating in February 2026 (weekly updates since ~2020-2026). I used DataCite metadata standard for better search results in repositories (DataONE, n.d.).</w:t>
       </w:r>
     </w:p>
     <w:p>
@@ -1212,7 +1511,133 @@
           <w:rFonts w:asciiTheme="minorHAnsi" w:hAnsiTheme="minorHAnsi" w:cstheme="minorHAnsi"/>
           <w:color w:val="000000" w:themeColor="text1"/>
         </w:rPr>
-        <w:t>No publications are listed or provided directly with the dataset on Kaggle—no overview paper or user citations tab. Literature search (Google Scholar: '"Seattle Combined Tree Point" OR "seattle-tree-point" kaggle', PubMed/Web of Science: "Seattle tree inventory" dataset, general web: site:nih.gov OR site:edu "anthonyylee seattle tree") yielded zero direct citations.</w:t>
+        <w:t>No publications are listed or provided directly with the dataset on Kaggle</w:t>
+      </w:r>
+      <w:r>
+        <w:rPr>
+          <w:rFonts w:asciiTheme="minorHAnsi" w:hAnsiTheme="minorHAnsi" w:cstheme="minorHAnsi"/>
+          <w:color w:val="000000" w:themeColor="text1"/>
+        </w:rPr>
+        <w:t xml:space="preserve">, nor </w:t>
+      </w:r>
+      <w:r>
+        <w:rPr>
+          <w:rFonts w:asciiTheme="minorHAnsi" w:hAnsiTheme="minorHAnsi" w:cstheme="minorHAnsi"/>
+          <w:color w:val="000000" w:themeColor="text1"/>
+        </w:rPr>
+        <w:t>overview paper or user citations tab. Literature search (Google Scholar: '"</w:t>
+      </w:r>
+      <w:r>
+        <w:rPr>
+          <w:rFonts w:asciiTheme="minorHAnsi" w:hAnsiTheme="minorHAnsi" w:cstheme="minorHAnsi"/>
+          <w:color w:val="000000" w:themeColor="text1"/>
+        </w:rPr>
+        <w:t>s</w:t>
+      </w:r>
+      <w:r>
+        <w:rPr>
+          <w:rFonts w:asciiTheme="minorHAnsi" w:hAnsiTheme="minorHAnsi" w:cstheme="minorHAnsi"/>
+          <w:color w:val="000000" w:themeColor="text1"/>
+        </w:rPr>
+        <w:t xml:space="preserve">eattle </w:t>
+      </w:r>
+      <w:r>
+        <w:rPr>
+          <w:rFonts w:asciiTheme="minorHAnsi" w:hAnsiTheme="minorHAnsi" w:cstheme="minorHAnsi"/>
+          <w:color w:val="000000" w:themeColor="text1"/>
+        </w:rPr>
+        <w:t>c</w:t>
+      </w:r>
+      <w:r>
+        <w:rPr>
+          <w:rFonts w:asciiTheme="minorHAnsi" w:hAnsiTheme="minorHAnsi" w:cstheme="minorHAnsi"/>
+          <w:color w:val="000000" w:themeColor="text1"/>
+        </w:rPr>
+        <w:t xml:space="preserve">ombined </w:t>
+      </w:r>
+      <w:r>
+        <w:rPr>
+          <w:rFonts w:asciiTheme="minorHAnsi" w:hAnsiTheme="minorHAnsi" w:cstheme="minorHAnsi"/>
+          <w:color w:val="000000" w:themeColor="text1"/>
+        </w:rPr>
+        <w:t>t</w:t>
+      </w:r>
+      <w:r>
+        <w:rPr>
+          <w:rFonts w:asciiTheme="minorHAnsi" w:hAnsiTheme="minorHAnsi" w:cstheme="minorHAnsi"/>
+          <w:color w:val="000000" w:themeColor="text1"/>
+        </w:rPr>
+        <w:t xml:space="preserve">ree </w:t>
+      </w:r>
+      <w:r>
+        <w:rPr>
+          <w:rFonts w:asciiTheme="minorHAnsi" w:hAnsiTheme="minorHAnsi" w:cstheme="minorHAnsi"/>
+          <w:color w:val="000000" w:themeColor="text1"/>
+        </w:rPr>
+        <w:t>p</w:t>
+      </w:r>
+      <w:r>
+        <w:rPr>
+          <w:rFonts w:asciiTheme="minorHAnsi" w:hAnsiTheme="minorHAnsi" w:cstheme="minorHAnsi"/>
+          <w:color w:val="000000" w:themeColor="text1"/>
+        </w:rPr>
+        <w:t>oint" OR "seattle-tree-point" kaggle', PubMed/Web of Science: "</w:t>
+      </w:r>
+      <w:r>
+        <w:rPr>
+          <w:rFonts w:asciiTheme="minorHAnsi" w:hAnsiTheme="minorHAnsi" w:cstheme="minorHAnsi"/>
+          <w:color w:val="000000" w:themeColor="text1"/>
+        </w:rPr>
+        <w:t>s</w:t>
+      </w:r>
+      <w:r>
+        <w:rPr>
+          <w:rFonts w:asciiTheme="minorHAnsi" w:hAnsiTheme="minorHAnsi" w:cstheme="minorHAnsi"/>
+          <w:color w:val="000000" w:themeColor="text1"/>
+        </w:rPr>
+        <w:t xml:space="preserve">eattle tree </w:t>
+      </w:r>
+      <w:r>
+        <w:rPr>
+          <w:rFonts w:asciiTheme="minorHAnsi" w:hAnsiTheme="minorHAnsi" w:cstheme="minorHAnsi"/>
+          <w:color w:val="000000" w:themeColor="text1"/>
+        </w:rPr>
+        <w:t>point</w:t>
+      </w:r>
+      <w:r>
+        <w:rPr>
+          <w:rFonts w:asciiTheme="minorHAnsi" w:hAnsiTheme="minorHAnsi" w:cstheme="minorHAnsi"/>
+          <w:color w:val="000000" w:themeColor="text1"/>
+        </w:rPr>
+        <w:t>" dataset, general web: site:nih.gov OR site:edu "anthonyylee</w:t>
+      </w:r>
+      <w:r>
+        <w:rPr>
+          <w:rFonts w:asciiTheme="minorHAnsi" w:hAnsiTheme="minorHAnsi" w:cstheme="minorHAnsi"/>
+          <w:color w:val="000000" w:themeColor="text1"/>
+        </w:rPr>
+        <w:t>"</w:t>
+      </w:r>
+      <w:r>
+        <w:rPr>
+          <w:rFonts w:asciiTheme="minorHAnsi" w:hAnsiTheme="minorHAnsi" w:cstheme="minorHAnsi"/>
+          <w:color w:val="000000" w:themeColor="text1"/>
+        </w:rPr>
+        <w:t xml:space="preserve"> </w:t>
+      </w:r>
+      <w:r>
+        <w:rPr>
+          <w:rFonts w:asciiTheme="minorHAnsi" w:hAnsiTheme="minorHAnsi" w:cstheme="minorHAnsi"/>
+          <w:color w:val="000000" w:themeColor="text1"/>
+        </w:rPr>
+        <w:t>AND "</w:t>
+      </w:r>
+      <w:r>
+        <w:rPr>
+          <w:rFonts w:asciiTheme="minorHAnsi" w:hAnsiTheme="minorHAnsi" w:cstheme="minorHAnsi"/>
+          <w:color w:val="000000" w:themeColor="text1"/>
+        </w:rPr>
+        <w:t>seattle tree") yielded zero direct citations.</w:t>
       </w:r>
       <w:r>
         <w:rPr>
@@ -1308,7 +1733,7 @@
         </w:rPr>
         <w:t xml:space="preserve">. </w:t>
       </w:r>
-      <w:hyperlink r:id="rId7" w:tgtFrame="_blank" w:history="1">
+      <w:hyperlink r:id="rId8" w:tgtFrame="_blank" w:history="1">
         <w:r>
           <w:rPr>
             <w:rFonts w:cstheme="minorHAnsi"/>
@@ -1349,7 +1774,7 @@
         </w:rPr>
         <w:t xml:space="preserve">]. Reddit. </w:t>
       </w:r>
-      <w:hyperlink r:id="rId8" w:tgtFrame="_blank" w:history="1">
+      <w:hyperlink r:id="rId9" w:tgtFrame="_blank" w:history="1">
         <w:r>
           <w:rPr>
             <w:rFonts w:cstheme="minorHAnsi"/>
@@ -1492,7 +1917,7 @@
         </w:rPr>
         <w:t xml:space="preserve"> via its re3data.org profile at </w:t>
       </w:r>
-      <w:hyperlink r:id="rId9" w:history="1">
+      <w:hyperlink r:id="rId10" w:history="1">
         <w:r>
           <w:rPr>
             <w:rStyle w:val="Hyperlink"/>
@@ -1557,7 +1982,7 @@
         </w:rPr>
         <w:t xml:space="preserve">Seattle_Combined_Tree_Point dataset </w:t>
       </w:r>
-      <w:hyperlink r:id="rId10" w:history="1">
+      <w:hyperlink r:id="rId11" w:history="1">
         <w:r>
           <w:rPr>
             <w:rStyle w:val="Hyperlink"/>
@@ -1734,6 +2159,12 @@
           <w:rFonts w:cstheme="minorHAnsi"/>
         </w:rPr>
       </w:pPr>
+      <w:r>
+        <w:rPr>
+          <w:rFonts w:cstheme="minorHAnsi"/>
+        </w:rPr>
+        <w:t>Submission Scope</w:t>
+      </w:r>
     </w:p>
     <w:p>
       <w:pPr>
@@ -1742,20 +2173,57 @@
           <w:rFonts w:cstheme="minorHAnsi"/>
         </w:rPr>
       </w:pPr>
-      <w:r>
-        <w:rPr>
-          <w:rFonts w:cstheme="minorHAnsi"/>
-        </w:rPr>
-        <w:t>Submission Scope</w:t>
-      </w:r>
-    </w:p>
-    <w:p>
-      <w:pPr>
+    </w:p>
+    <w:p>
+      <w:pPr>
+        <w:spacing w:line="360" w:lineRule="auto"/>
         <w:outlineLvl w:val="1"/>
         <w:rPr>
           <w:rFonts w:cstheme="minorHAnsi"/>
         </w:rPr>
       </w:pPr>
+      <w:r>
+        <w:rPr>
+          <w:rFonts w:cstheme="minorHAnsi"/>
+        </w:rPr>
+        <w:t xml:space="preserve">NCEI has a defined collection scope rather than open submissions from anyone. It targets NOAA-mandated environmental data, such as observations from Information Service </w:t>
+      </w:r>
+      <w:r>
+        <w:rPr>
+          <w:rFonts w:cstheme="minorHAnsi"/>
+        </w:rPr>
+        <w:t>S</w:t>
+      </w:r>
+      <w:r>
+        <w:rPr>
+          <w:rFonts w:cstheme="minorHAnsi"/>
+        </w:rPr>
+        <w:t>ystems</w:t>
+      </w:r>
+      <w:r>
+        <w:rPr>
+          <w:rFonts w:cstheme="minorHAnsi"/>
+        </w:rPr>
+        <w:t xml:space="preserve"> (ISS)</w:t>
+      </w:r>
+      <w:r>
+        <w:rPr>
+          <w:rFonts w:cstheme="minorHAnsi"/>
+        </w:rPr>
+        <w:t>. It accepts complementary non-NOAA data through formal agreements, emphasizing contributions to the global environmental record. Eligible contributors include NOAA programs, federal partners, and institutions whose data aligns with geophysical or climate archives. General public uploads are restricted by institutional criteria</w:t>
+      </w:r>
+      <w:r>
+        <w:rPr>
+          <w:rFonts w:cstheme="minorHAnsi"/>
+        </w:rPr>
+        <w:t>, so the datasets would best be combined into a research project done by an institution</w:t>
+      </w:r>
+      <w:r>
+        <w:rPr>
+          <w:rFonts w:cstheme="minorHAnsi"/>
+        </w:rPr>
+        <w:t>.</w:t>
+      </w:r>
     </w:p>
     <w:p>
       <w:pPr>
@@ -1765,11 +2233,255 @@
           <w:rFonts w:cstheme="minorHAnsi"/>
         </w:rPr>
       </w:pPr>
-      <w:r>
-        <w:rPr>
-          <w:rFonts w:cstheme="minorHAnsi"/>
-        </w:rPr>
-        <w:t xml:space="preserve">NCEI has a defined collection scope rather than open submissions from anyone. It targets NOAA-mandated environmental data, such as observations from Information Service </w:t>
+    </w:p>
+    <w:p>
+      <w:pPr>
+        <w:spacing w:line="360" w:lineRule="auto"/>
+        <w:outlineLvl w:val="1"/>
+        <w:rPr>
+          <w:rFonts w:cstheme="minorHAnsi"/>
+        </w:rPr>
+      </w:pPr>
+      <w:r>
+        <w:rPr>
+          <w:rFonts w:cstheme="minorHAnsi"/>
+        </w:rPr>
+        <w:t>Preferred data types prioritize observations over simulations (unless mission-critical), domains focus on environmental realms (excluding social sciences), and formats must be well-structured with supporting documentation like user guides. As a CoreTrustSeal-certified repository, NCEI adheres to rigorous best-practice criteria, ensuring reliability for datasets like Seattle's datase</w:t>
+      </w:r>
+      <w:r>
+        <w:rPr>
+          <w:rFonts w:cstheme="minorHAnsi"/>
+        </w:rPr>
+        <w:t>t</w:t>
+      </w:r>
+      <w:r>
+        <w:rPr>
+          <w:rFonts w:cstheme="minorHAnsi"/>
+        </w:rPr>
+        <w:t>, which could qualify if tied to NOAA-relevant urban climate studies.</w:t>
+      </w:r>
+    </w:p>
+    <w:p>
+      <w:pPr>
+        <w:outlineLvl w:val="1"/>
+        <w:rPr>
+          <w:rFonts w:cstheme="minorHAnsi"/>
+        </w:rPr>
+      </w:pPr>
+    </w:p>
+    <w:p>
+      <w:pPr>
+        <w:outlineLvl w:val="1"/>
+        <w:rPr>
+          <w:rFonts w:cstheme="minorHAnsi"/>
+        </w:rPr>
+      </w:pPr>
+      <w:r>
+        <w:rPr>
+          <w:rFonts w:cstheme="minorHAnsi"/>
+        </w:rPr>
+        <w:t>Submission Guidance</w:t>
+      </w:r>
+    </w:p>
+    <w:p>
+      <w:pPr>
+        <w:outlineLvl w:val="1"/>
+        <w:rPr>
+          <w:rFonts w:cstheme="minorHAnsi"/>
+        </w:rPr>
+      </w:pPr>
+    </w:p>
+    <w:p>
+      <w:pPr>
+        <w:spacing w:line="360" w:lineRule="auto"/>
+        <w:outlineLvl w:val="1"/>
+        <w:rPr>
+          <w:rFonts w:cstheme="minorHAnsi"/>
+        </w:rPr>
+      </w:pPr>
+      <w:r>
+        <w:rPr>
+          <w:rFonts w:cstheme="minorHAnsi"/>
+        </w:rPr>
+        <w:t xml:space="preserve">NCEI provides detailed guidance for the Submission Information Package (SIP), requiring archive-ready data with metadata on provenance, formats, algorithms, and Section 508-compliant documentations (e.g., README files, format specs). Prospective submitters first contact archive staff via email for appraisal, where specialists </w:t>
+      </w:r>
+      <w:r>
+        <w:rPr>
+          <w:rFonts w:cstheme="minorHAnsi"/>
+        </w:rPr>
+        <w:lastRenderedPageBreak/>
+        <w:t xml:space="preserve">evaluate fit based on relevance, user base, and alignment with NOAA's Scientific Records Appraisal </w:t>
+      </w:r>
+      <w:r>
+        <w:rPr>
+          <w:rFonts w:cstheme="minorHAnsi"/>
+        </w:rPr>
+        <w:t xml:space="preserve">(SRA) </w:t>
+      </w:r>
+      <w:r>
+        <w:rPr>
+          <w:rFonts w:cstheme="minorHAnsi"/>
+        </w:rPr>
+        <w:t>process. Consulting can occur through submission portals such as Send2NCEI (S2N), which requires setup for both S2N and Login.gov to upload non-repeating datasets under 20</w:t>
+      </w:r>
+      <w:r>
+        <w:rPr>
+          <w:rFonts w:cstheme="minorHAnsi"/>
+        </w:rPr>
+        <w:t xml:space="preserve"> </w:t>
+      </w:r>
+      <w:r>
+        <w:rPr>
+          <w:rFonts w:cstheme="minorHAnsi"/>
+        </w:rPr>
+        <w:t>GB; larger or recurring data use the Advanced Tracking and Resource Tool for A</w:t>
+      </w:r>
+      <w:r>
+        <w:rPr>
+          <w:rFonts w:cstheme="minorHAnsi"/>
+        </w:rPr>
+        <w:t>r</w:t>
+      </w:r>
+      <w:r>
+        <w:rPr>
+          <w:rFonts w:cstheme="minorHAnsi"/>
+        </w:rPr>
+        <w:t>chive Collections (ATRAC).</w:t>
+      </w:r>
+    </w:p>
+    <w:p>
+      <w:pPr>
+        <w:spacing w:line="360" w:lineRule="auto"/>
+        <w:outlineLvl w:val="1"/>
+        <w:rPr>
+          <w:rFonts w:cstheme="minorHAnsi"/>
+        </w:rPr>
+      </w:pPr>
+    </w:p>
+    <w:p>
+      <w:pPr>
+        <w:spacing w:line="360" w:lineRule="auto"/>
+        <w:outlineLvl w:val="1"/>
+        <w:rPr>
+          <w:rFonts w:cstheme="minorHAnsi"/>
+        </w:rPr>
+      </w:pPr>
+      <w:r>
+        <w:rPr>
+          <w:rFonts w:cstheme="minorHAnsi"/>
+        </w:rPr>
+        <w:t>NCEI offers human assistance: submitters can email the archive office to connect with specialists who guide packaging, method selection, and compliance. This pre-submission support helps prepare SIPs meeting federal standards.</w:t>
+      </w:r>
+    </w:p>
+    <w:p>
+      <w:pPr>
+        <w:spacing w:line="360" w:lineRule="auto"/>
+        <w:outlineLvl w:val="1"/>
+        <w:rPr>
+          <w:rFonts w:cstheme="minorHAnsi"/>
+        </w:rPr>
+      </w:pPr>
+    </w:p>
+    <w:p>
+      <w:pPr>
+        <w:spacing w:line="360" w:lineRule="auto"/>
+        <w:outlineLvl w:val="1"/>
+        <w:rPr>
+          <w:rFonts w:cstheme="minorHAnsi"/>
+        </w:rPr>
+      </w:pPr>
+      <w:r>
+        <w:rPr>
+          <w:rFonts w:cstheme="minorHAnsi"/>
+        </w:rPr>
+        <w:t>Metadata must follow NCEI/NOAA standards, including the I</w:t>
+      </w:r>
+      <w:r>
+        <w:rPr>
+          <w:rFonts w:cstheme="minorHAnsi"/>
+        </w:rPr>
+        <w:t>nternational Organization for Standardization (I</w:t>
+      </w:r>
+      <w:r>
+        <w:rPr>
+          <w:rFonts w:cstheme="minorHAnsi"/>
+        </w:rPr>
+        <w:t>SO</w:t>
+      </w:r>
+      <w:r>
+        <w:rPr>
+          <w:rFonts w:cstheme="minorHAnsi"/>
+        </w:rPr>
+        <w:t>)</w:t>
+      </w:r>
+      <w:r>
+        <w:rPr>
+          <w:rFonts w:cstheme="minorHAnsi"/>
+        </w:rPr>
+        <w:t xml:space="preserve"> 19115/19139 series for geospatial data (ensuring authenticity and preservation), plus Dublin Core derivatives for discovery. This structure guarantees long-term usability, with SIPs including data files and technical metadata, tailored for provenance, quality, and reuse. </w:t>
+      </w:r>
+    </w:p>
+    <w:p>
+      <w:pPr>
+        <w:outlineLvl w:val="1"/>
+        <w:rPr>
+          <w:rFonts w:cstheme="minorHAnsi"/>
+        </w:rPr>
+      </w:pPr>
+    </w:p>
+    <w:p>
+      <w:pPr>
+        <w:outlineLvl w:val="1"/>
+        <w:rPr>
+          <w:rFonts w:cstheme="minorHAnsi"/>
+        </w:rPr>
+      </w:pPr>
+      <w:r>
+        <w:rPr>
+          <w:rFonts w:cstheme="minorHAnsi"/>
+        </w:rPr>
+        <w:t>Access Mechanisms</w:t>
+      </w:r>
+    </w:p>
+    <w:p>
+      <w:pPr>
+        <w:outlineLvl w:val="1"/>
+        <w:rPr>
+          <w:rFonts w:cstheme="minorHAnsi"/>
+        </w:rPr>
+      </w:pPr>
+    </w:p>
+    <w:p>
+      <w:pPr>
+        <w:spacing w:line="360" w:lineRule="auto"/>
+        <w:outlineLvl w:val="1"/>
+        <w:rPr>
+          <w:rFonts w:cstheme="minorHAnsi"/>
+        </w:rPr>
+      </w:pPr>
+      <w:r>
+        <w:rPr>
+          <w:rFonts w:cstheme="minorHAnsi"/>
+        </w:rPr>
+        <w:t>No login is required for most downloads, enabling public access via intuitive web interfaces. NCEI offers multiple mechanisms: direct file downloads through the NCEI Data Access tool, subsetting services, Map and G</w:t>
+      </w:r>
+      <w:r>
+        <w:rPr>
+          <w:rFonts w:cstheme="minorHAnsi"/>
+        </w:rPr>
+        <w:t xml:space="preserve">eographic </w:t>
+      </w:r>
+      <w:r>
+        <w:rPr>
+          <w:rFonts w:cstheme="minorHAnsi"/>
+        </w:rPr>
+        <w:t>I</w:t>
+      </w:r>
+      <w:r>
+        <w:rPr>
+          <w:rFonts w:cstheme="minorHAnsi"/>
+        </w:rPr>
+        <w:t xml:space="preserve">nformation </w:t>
       </w:r>
       <w:r>
         <w:rPr>
@@ -1781,36 +2493,149 @@
         <w:rPr>
           <w:rFonts w:cstheme="minorHAnsi"/>
         </w:rPr>
-        <w:t>ystems</w:t>
-      </w:r>
-      <w:r>
-        <w:rPr>
-          <w:rFonts w:cstheme="minorHAnsi"/>
-        </w:rPr>
-        <w:t xml:space="preserve"> (ISS)</w:t>
-      </w:r>
-      <w:r>
-        <w:rPr>
-          <w:rFonts w:cstheme="minorHAnsi"/>
-        </w:rPr>
-        <w:t>. It accepts complementary non-NOAA data through formal agreements, emphasizing contributions to the global environmental record. Eligible contributors include NOAA programs, federal partners, and institutions whose data aligns with geophysical or climate archives. General public uploads are restricted by institutional criteria</w:t>
-      </w:r>
-      <w:r>
-        <w:rPr>
-          <w:rFonts w:cstheme="minorHAnsi"/>
-        </w:rPr>
-        <w:t>, so the datasets would best be combined into a research project done by an institution</w:t>
-      </w:r>
-      <w:r>
-        <w:rPr>
-          <w:rFonts w:cstheme="minorHAnsi"/>
-        </w:rPr>
-        <w:t>.</w:t>
-      </w:r>
-    </w:p>
-    <w:p>
-      <w:pPr>
-        <w:spacing w:line="360" w:lineRule="auto"/>
+        <w:t>ystems (GIS)</w:t>
+      </w:r>
+      <w:r>
+        <w:rPr>
+          <w:rFonts w:cstheme="minorHAnsi"/>
+        </w:rPr>
+        <w:t xml:space="preserve"> </w:t>
+      </w:r>
+      <w:r>
+        <w:rPr>
+          <w:rFonts w:cstheme="minorHAnsi"/>
+        </w:rPr>
+        <w:t>Representational State Transfer (</w:t>
+      </w:r>
+      <w:r>
+        <w:rPr>
+          <w:rFonts w:cstheme="minorHAnsi"/>
+        </w:rPr>
+        <w:t>REST</w:t>
+      </w:r>
+      <w:r>
+        <w:rPr>
+          <w:rFonts w:cstheme="minorHAnsi"/>
+        </w:rPr>
+        <w:t>)</w:t>
+      </w:r>
+      <w:r>
+        <w:rPr>
+          <w:rFonts w:cstheme="minorHAnsi"/>
+        </w:rPr>
+        <w:t xml:space="preserve"> endpoints, Climate Data Online</w:t>
+      </w:r>
+      <w:r>
+        <w:rPr>
+          <w:rFonts w:cstheme="minorHAnsi"/>
+        </w:rPr>
+        <w:t xml:space="preserve"> (CDO)</w:t>
+      </w:r>
+      <w:r>
+        <w:rPr>
+          <w:rFonts w:cstheme="minorHAnsi"/>
+        </w:rPr>
+        <w:t xml:space="preserve"> </w:t>
+      </w:r>
+      <w:r>
+        <w:rPr>
+          <w:rFonts w:cstheme="minorHAnsi"/>
+        </w:rPr>
+        <w:t>Application Programming Interfaces (APIs)</w:t>
+      </w:r>
+      <w:r>
+        <w:rPr>
+          <w:rFonts w:cstheme="minorHAnsi"/>
+        </w:rPr>
+        <w:t xml:space="preserve"> (with a token option for heavy scripting), and cloud access via NOAA Open Data Dissemination</w:t>
+      </w:r>
+      <w:r>
+        <w:rPr>
+          <w:rFonts w:cstheme="minorHAnsi"/>
+        </w:rPr>
+        <w:t xml:space="preserve"> (NODD)</w:t>
+      </w:r>
+      <w:r>
+        <w:rPr>
+          <w:rFonts w:cstheme="minorHAnsi"/>
+        </w:rPr>
+        <w:t xml:space="preserve"> on A</w:t>
+      </w:r>
+      <w:r>
+        <w:rPr>
+          <w:rFonts w:cstheme="minorHAnsi"/>
+        </w:rPr>
+        <w:t xml:space="preserve">mazon </w:t>
+      </w:r>
+      <w:r>
+        <w:rPr>
+          <w:rFonts w:cstheme="minorHAnsi"/>
+        </w:rPr>
+        <w:t>W</w:t>
+      </w:r>
+      <w:r>
+        <w:rPr>
+          <w:rFonts w:cstheme="minorHAnsi"/>
+        </w:rPr>
+        <w:t xml:space="preserve">eb </w:t>
+      </w:r>
+      <w:r>
+        <w:rPr>
+          <w:rFonts w:cstheme="minorHAnsi"/>
+        </w:rPr>
+        <w:t>S</w:t>
+      </w:r>
+      <w:r>
+        <w:rPr>
+          <w:rFonts w:cstheme="minorHAnsi"/>
+        </w:rPr>
+        <w:t>ervices (AWS)</w:t>
+      </w:r>
+      <w:r>
+        <w:rPr>
+          <w:rFonts w:cstheme="minorHAnsi"/>
+        </w:rPr>
+        <w:t xml:space="preserve">, Google Cloud, and </w:t>
+      </w:r>
+      <w:r>
+        <w:rPr>
+          <w:rFonts w:cstheme="minorHAnsi"/>
+        </w:rPr>
+        <w:t xml:space="preserve">MS </w:t>
+      </w:r>
+      <w:r>
+        <w:rPr>
+          <w:rFonts w:cstheme="minorHAnsi"/>
+        </w:rPr>
+        <w:t xml:space="preserve">Azure. The </w:t>
+      </w:r>
+      <w:r>
+        <w:rPr>
+          <w:rFonts w:cstheme="minorHAnsi"/>
+        </w:rPr>
+        <w:t>Digital Object Identifier (</w:t>
+      </w:r>
+      <w:r>
+        <w:rPr>
+          <w:rFonts w:cstheme="minorHAnsi"/>
+        </w:rPr>
+        <w:t>DOI</w:t>
+      </w:r>
+      <w:r>
+        <w:rPr>
+          <w:rFonts w:cstheme="minorHAnsi"/>
+        </w:rPr>
+        <w:t>)</w:t>
+      </w:r>
+      <w:r>
+        <w:rPr>
+          <w:rFonts w:cstheme="minorHAnsi"/>
+        </w:rPr>
+        <w:t xml:space="preserve">, metadata, and ISO-based records in the dataset pages and catalogs also ensure discoverability across federal search tools. </w:t>
+      </w:r>
+    </w:p>
+    <w:p>
+      <w:pPr>
         <w:outlineLvl w:val="1"/>
         <w:rPr>
           <w:rFonts w:cstheme="minorHAnsi"/>
@@ -1819,7 +2644,6 @@
     </w:p>
     <w:p>
       <w:pPr>
-        <w:spacing w:line="360" w:lineRule="auto"/>
         <w:outlineLvl w:val="1"/>
         <w:rPr>
           <w:rFonts w:cstheme="minorHAnsi"/>
@@ -1829,19 +2653,7 @@
         <w:rPr>
           <w:rFonts w:cstheme="minorHAnsi"/>
         </w:rPr>
-        <w:t>Preferred data types prioritize observations over simulations (unless mission-critical), domains focus on environmental realms (excluding social sciences), and formats must be well-structured with supporting documentation like user guides. As a CoreTrustSeal-certified repository, NCEI adheres to rigorous best-practice criteria, ensuring reliability for datasets like Seattle's datase</w:t>
-      </w:r>
-      <w:r>
-        <w:rPr>
-          <w:rFonts w:cstheme="minorHAnsi"/>
-        </w:rPr>
-        <w:t>t</w:t>
-      </w:r>
-      <w:r>
-        <w:rPr>
-          <w:rFonts w:cstheme="minorHAnsi"/>
-        </w:rPr>
-        <w:t>, which could qualify if tied to NOAA-relevant urban climate studies.</w:t>
+        <w:t>Dissemination Information Package</w:t>
       </w:r>
     </w:p>
     <w:p>
@@ -1854,6 +2666,7 @@
     </w:p>
     <w:p>
       <w:pPr>
+        <w:spacing w:line="360" w:lineRule="auto"/>
         <w:outlineLvl w:val="1"/>
         <w:rPr>
           <w:rFonts w:cstheme="minorHAnsi"/>
@@ -1863,402 +2676,6 @@
         <w:rPr>
           <w:rFonts w:cstheme="minorHAnsi"/>
         </w:rPr>
-        <w:t>Submission Guidance</w:t>
-      </w:r>
-    </w:p>
-    <w:p>
-      <w:pPr>
-        <w:outlineLvl w:val="1"/>
-        <w:rPr>
-          <w:rFonts w:cstheme="minorHAnsi"/>
-        </w:rPr>
-      </w:pPr>
-    </w:p>
-    <w:p>
-      <w:pPr>
-        <w:spacing w:line="360" w:lineRule="auto"/>
-        <w:outlineLvl w:val="1"/>
-        <w:rPr>
-          <w:rFonts w:cstheme="minorHAnsi"/>
-        </w:rPr>
-      </w:pPr>
-      <w:r>
-        <w:rPr>
-          <w:rFonts w:cstheme="minorHAnsi"/>
-        </w:rPr>
-        <w:t xml:space="preserve">NCEI provides detailed guidance for the Submission Information Package (SIP), requiring archive-ready data with metadata on provenance, formats, algorithms, and Section 508-compliant documentations (e.g., README </w:t>
-      </w:r>
-      <w:r>
-        <w:rPr>
-          <w:rFonts w:cstheme="minorHAnsi"/>
-        </w:rPr>
-        <w:lastRenderedPageBreak/>
-        <w:t xml:space="preserve">files, format specs). Prospective submitters first contact archive staff via email for appraisal, where specialists evaluate fit based on relevance, user base, and alignment with NOAA's Scientific Records Appraisal </w:t>
-      </w:r>
-      <w:r>
-        <w:rPr>
-          <w:rFonts w:cstheme="minorHAnsi"/>
-        </w:rPr>
-        <w:t xml:space="preserve">(SRA) </w:t>
-      </w:r>
-      <w:r>
-        <w:rPr>
-          <w:rFonts w:cstheme="minorHAnsi"/>
-        </w:rPr>
-        <w:t>process. Consulting can occur through submission portals such as Send2NCEI (S2N), which requires setup for both S2N and Login.gov to upload non-repeating datasets under 20</w:t>
-      </w:r>
-      <w:r>
-        <w:rPr>
-          <w:rFonts w:cstheme="minorHAnsi"/>
-        </w:rPr>
-        <w:t xml:space="preserve"> </w:t>
-      </w:r>
-      <w:r>
-        <w:rPr>
-          <w:rFonts w:cstheme="minorHAnsi"/>
-        </w:rPr>
-        <w:t>GB; larger or recurring data use the Advanced Tracking and Resource Tool for A</w:t>
-      </w:r>
-      <w:r>
-        <w:rPr>
-          <w:rFonts w:cstheme="minorHAnsi"/>
-        </w:rPr>
-        <w:t>r</w:t>
-      </w:r>
-      <w:r>
-        <w:rPr>
-          <w:rFonts w:cstheme="minorHAnsi"/>
-        </w:rPr>
-        <w:t>chive Collections (ATRAC).</w:t>
-      </w:r>
-    </w:p>
-    <w:p>
-      <w:pPr>
-        <w:spacing w:line="360" w:lineRule="auto"/>
-        <w:outlineLvl w:val="1"/>
-        <w:rPr>
-          <w:rFonts w:cstheme="minorHAnsi"/>
-        </w:rPr>
-      </w:pPr>
-    </w:p>
-    <w:p>
-      <w:pPr>
-        <w:spacing w:line="360" w:lineRule="auto"/>
-        <w:outlineLvl w:val="1"/>
-        <w:rPr>
-          <w:rFonts w:cstheme="minorHAnsi"/>
-        </w:rPr>
-      </w:pPr>
-      <w:r>
-        <w:rPr>
-          <w:rFonts w:cstheme="minorHAnsi"/>
-        </w:rPr>
-        <w:t>NCEI offers human assistance: submitters can email the archive office to connect with specialists who guide packaging, method selection, and compliance. This pre-submission support helps prepare SIPs meeting federal standards.</w:t>
-      </w:r>
-    </w:p>
-    <w:p>
-      <w:pPr>
-        <w:spacing w:line="360" w:lineRule="auto"/>
-        <w:outlineLvl w:val="1"/>
-        <w:rPr>
-          <w:rFonts w:cstheme="minorHAnsi"/>
-        </w:rPr>
-      </w:pPr>
-    </w:p>
-    <w:p>
-      <w:pPr>
-        <w:spacing w:line="360" w:lineRule="auto"/>
-        <w:outlineLvl w:val="1"/>
-        <w:rPr>
-          <w:rFonts w:cstheme="minorHAnsi"/>
-        </w:rPr>
-      </w:pPr>
-      <w:r>
-        <w:rPr>
-          <w:rFonts w:cstheme="minorHAnsi"/>
-        </w:rPr>
-        <w:t>Metadata must follow NCEI/NOAA standards, including the I</w:t>
-      </w:r>
-      <w:r>
-        <w:rPr>
-          <w:rFonts w:cstheme="minorHAnsi"/>
-        </w:rPr>
-        <w:t>nternational Organization for Standardization (I</w:t>
-      </w:r>
-      <w:r>
-        <w:rPr>
-          <w:rFonts w:cstheme="minorHAnsi"/>
-        </w:rPr>
-        <w:t>SO</w:t>
-      </w:r>
-      <w:r>
-        <w:rPr>
-          <w:rFonts w:cstheme="minorHAnsi"/>
-        </w:rPr>
-        <w:t>)</w:t>
-      </w:r>
-      <w:r>
-        <w:rPr>
-          <w:rFonts w:cstheme="minorHAnsi"/>
-        </w:rPr>
-        <w:t xml:space="preserve"> 19115/19139 series for geospatial data (ensuring authenticity and preservation), plus Dublin Core derivatives for discovery. This structure guarantees long-term usability, with SIPs including data files and technical metadata, tailored for provenance, quality, and reuse. </w:t>
-      </w:r>
-    </w:p>
-    <w:p>
-      <w:pPr>
-        <w:outlineLvl w:val="1"/>
-        <w:rPr>
-          <w:rFonts w:cstheme="minorHAnsi"/>
-        </w:rPr>
-      </w:pPr>
-    </w:p>
-    <w:p>
-      <w:pPr>
-        <w:outlineLvl w:val="1"/>
-        <w:rPr>
-          <w:rFonts w:cstheme="minorHAnsi"/>
-        </w:rPr>
-      </w:pPr>
-      <w:r>
-        <w:rPr>
-          <w:rFonts w:cstheme="minorHAnsi"/>
-        </w:rPr>
-        <w:t>Access Mechanisms</w:t>
-      </w:r>
-    </w:p>
-    <w:p>
-      <w:pPr>
-        <w:outlineLvl w:val="1"/>
-        <w:rPr>
-          <w:rFonts w:cstheme="minorHAnsi"/>
-        </w:rPr>
-      </w:pPr>
-    </w:p>
-    <w:p>
-      <w:pPr>
-        <w:spacing w:line="360" w:lineRule="auto"/>
-        <w:outlineLvl w:val="1"/>
-        <w:rPr>
-          <w:rFonts w:cstheme="minorHAnsi"/>
-        </w:rPr>
-      </w:pPr>
-      <w:r>
-        <w:rPr>
-          <w:rFonts w:cstheme="minorHAnsi"/>
-        </w:rPr>
-        <w:t>No login is required for most downloads, enabling public access via intuitive web interfaces. NCEI offers multiple mechanisms: direct file downloads through the NCEI Data Access tool, subsetting services, Map and G</w:t>
-      </w:r>
-      <w:r>
-        <w:rPr>
-          <w:rFonts w:cstheme="minorHAnsi"/>
-        </w:rPr>
-        <w:t xml:space="preserve">eographic </w:t>
-      </w:r>
-      <w:r>
-        <w:rPr>
-          <w:rFonts w:cstheme="minorHAnsi"/>
-        </w:rPr>
-        <w:t>I</w:t>
-      </w:r>
-      <w:r>
-        <w:rPr>
-          <w:rFonts w:cstheme="minorHAnsi"/>
-        </w:rPr>
-        <w:t xml:space="preserve">nformation </w:t>
-      </w:r>
-      <w:r>
-        <w:rPr>
-          <w:rFonts w:cstheme="minorHAnsi"/>
-        </w:rPr>
-        <w:t>S</w:t>
-      </w:r>
-      <w:r>
-        <w:rPr>
-          <w:rFonts w:cstheme="minorHAnsi"/>
-        </w:rPr>
-        <w:t>ystems (GIS)</w:t>
-      </w:r>
-      <w:r>
-        <w:rPr>
-          <w:rFonts w:cstheme="minorHAnsi"/>
-        </w:rPr>
-        <w:t xml:space="preserve"> </w:t>
-      </w:r>
-      <w:r>
-        <w:rPr>
-          <w:rFonts w:cstheme="minorHAnsi"/>
-        </w:rPr>
-        <w:t>Representational State Transfer (</w:t>
-      </w:r>
-      <w:r>
-        <w:rPr>
-          <w:rFonts w:cstheme="minorHAnsi"/>
-        </w:rPr>
-        <w:t>REST</w:t>
-      </w:r>
-      <w:r>
-        <w:rPr>
-          <w:rFonts w:cstheme="minorHAnsi"/>
-        </w:rPr>
-        <w:t>)</w:t>
-      </w:r>
-      <w:r>
-        <w:rPr>
-          <w:rFonts w:cstheme="minorHAnsi"/>
-        </w:rPr>
-        <w:t xml:space="preserve"> endpoints, Climate Data Online</w:t>
-      </w:r>
-      <w:r>
-        <w:rPr>
-          <w:rFonts w:cstheme="minorHAnsi"/>
-        </w:rPr>
-        <w:t xml:space="preserve"> (CDO)</w:t>
-      </w:r>
-      <w:r>
-        <w:rPr>
-          <w:rFonts w:cstheme="minorHAnsi"/>
-        </w:rPr>
-        <w:t xml:space="preserve"> </w:t>
-      </w:r>
-      <w:r>
-        <w:rPr>
-          <w:rFonts w:cstheme="minorHAnsi"/>
-        </w:rPr>
-        <w:t>Application Programming Interfaces (APIs)</w:t>
-      </w:r>
-      <w:r>
-        <w:rPr>
-          <w:rFonts w:cstheme="minorHAnsi"/>
-        </w:rPr>
-        <w:t xml:space="preserve"> (with a token option for heavy scripting), and cloud access via NOAA Open Data Dissemination</w:t>
-      </w:r>
-      <w:r>
-        <w:rPr>
-          <w:rFonts w:cstheme="minorHAnsi"/>
-        </w:rPr>
-        <w:t xml:space="preserve"> (NODD)</w:t>
-      </w:r>
-      <w:r>
-        <w:rPr>
-          <w:rFonts w:cstheme="minorHAnsi"/>
-        </w:rPr>
-        <w:t xml:space="preserve"> on A</w:t>
-      </w:r>
-      <w:r>
-        <w:rPr>
-          <w:rFonts w:cstheme="minorHAnsi"/>
-        </w:rPr>
-        <w:t xml:space="preserve">mazon </w:t>
-      </w:r>
-      <w:r>
-        <w:rPr>
-          <w:rFonts w:cstheme="minorHAnsi"/>
-        </w:rPr>
-        <w:t>W</w:t>
-      </w:r>
-      <w:r>
-        <w:rPr>
-          <w:rFonts w:cstheme="minorHAnsi"/>
-        </w:rPr>
-        <w:t xml:space="preserve">eb </w:t>
-      </w:r>
-      <w:r>
-        <w:rPr>
-          <w:rFonts w:cstheme="minorHAnsi"/>
-        </w:rPr>
-        <w:t>S</w:t>
-      </w:r>
-      <w:r>
-        <w:rPr>
-          <w:rFonts w:cstheme="minorHAnsi"/>
-        </w:rPr>
-        <w:t>ervices (AWS)</w:t>
-      </w:r>
-      <w:r>
-        <w:rPr>
-          <w:rFonts w:cstheme="minorHAnsi"/>
-        </w:rPr>
-        <w:t xml:space="preserve">, Google Cloud, and </w:t>
-      </w:r>
-      <w:r>
-        <w:rPr>
-          <w:rFonts w:cstheme="minorHAnsi"/>
-        </w:rPr>
-        <w:t xml:space="preserve">MS </w:t>
-      </w:r>
-      <w:r>
-        <w:rPr>
-          <w:rFonts w:cstheme="minorHAnsi"/>
-        </w:rPr>
-        <w:t xml:space="preserve">Azure. The </w:t>
-      </w:r>
-      <w:r>
-        <w:rPr>
-          <w:rFonts w:cstheme="minorHAnsi"/>
-        </w:rPr>
-        <w:t>Digital Object Identifier (</w:t>
-      </w:r>
-      <w:r>
-        <w:rPr>
-          <w:rFonts w:cstheme="minorHAnsi"/>
-        </w:rPr>
-        <w:t>DOI</w:t>
-      </w:r>
-      <w:r>
-        <w:rPr>
-          <w:rFonts w:cstheme="minorHAnsi"/>
-        </w:rPr>
-        <w:t>)</w:t>
-      </w:r>
-      <w:r>
-        <w:rPr>
-          <w:rFonts w:cstheme="minorHAnsi"/>
-        </w:rPr>
-        <w:t xml:space="preserve">, metadata, and ISO-based records in the dataset pages and catalogs also ensure discoverability across federal search tools. </w:t>
-      </w:r>
-    </w:p>
-    <w:p>
-      <w:pPr>
-        <w:outlineLvl w:val="1"/>
-        <w:rPr>
-          <w:rFonts w:cstheme="minorHAnsi"/>
-        </w:rPr>
-      </w:pPr>
-    </w:p>
-    <w:p>
-      <w:pPr>
-        <w:outlineLvl w:val="1"/>
-        <w:rPr>
-          <w:rFonts w:cstheme="minorHAnsi"/>
-        </w:rPr>
-      </w:pPr>
-      <w:r>
-        <w:rPr>
-          <w:rFonts w:cstheme="minorHAnsi"/>
-        </w:rPr>
-        <w:t>Dissemination Information Package</w:t>
-      </w:r>
-    </w:p>
-    <w:p>
-      <w:pPr>
-        <w:outlineLvl w:val="1"/>
-        <w:rPr>
-          <w:rFonts w:cstheme="minorHAnsi"/>
-        </w:rPr>
-      </w:pPr>
-    </w:p>
-    <w:p>
-      <w:pPr>
-        <w:spacing w:line="360" w:lineRule="auto"/>
-        <w:outlineLvl w:val="1"/>
-        <w:rPr>
-          <w:rFonts w:cstheme="minorHAnsi"/>
-        </w:rPr>
-      </w:pPr>
-      <w:r>
-        <w:rPr>
-          <w:rFonts w:cstheme="minorHAnsi"/>
-        </w:rPr>
         <w:t xml:space="preserve">In the Open Archival Information System </w:t>
       </w:r>
       <w:r>
@@ -2307,12 +2724,24 @@
         <w:rPr>
           <w:rFonts w:cstheme="minorHAnsi"/>
         </w:rPr>
-        <w:t>software, hardware, libraries, process requirements needed to interpret and use the data), plus derived products like previews and documentation for broad reuse. For the Seattle tree dataset, this self-contained DIP would deliver point data files, ISO 19115 metadata records with format dependencies and platform specifics, method descriptions, and API-ready subsets, accessible via web portals or cloud for seamless integration into urban planning models, even as digital tools evolve. This structure maximizes the data's value in environmental applications while upholding NCEI's open dissemination values.</w:t>
-      </w:r>
-    </w:p>
-    <w:p>
-      <w:pPr>
-        <w:outlineLvl w:val="1"/>
+        <w:t xml:space="preserve">software, hardware, libraries, process requirements needed to interpret and use the data), plus derived products like previews and documentation for broad reuse. For the Seattle </w:t>
+      </w:r>
+      <w:r>
+        <w:rPr>
+          <w:rFonts w:cstheme="minorHAnsi"/>
+        </w:rPr>
+        <w:t xml:space="preserve">combined </w:t>
+      </w:r>
+      <w:r>
+        <w:rPr>
+          <w:rFonts w:cstheme="minorHAnsi"/>
+        </w:rPr>
+        <w:t>tree dataset, this self-contained DIP would deliver point data files, ISO 19115 metadata records with format dependencies and platform specifics, method descriptions, and API-ready subsets, accessible via web portals or cloud for seamless integration into urban planning models, even as digital tools evolve. This structure maximizes the data's value in environmental applications while upholding NCEI's open dissemination values.</w:t>
+      </w:r>
+    </w:p>
+    <w:p>
+      <w:pPr>
+        <w:jc w:val="center"/>
         <w:rPr>
           <w:rFonts w:cstheme="minorHAnsi"/>
           <w:sz w:val="28"/>
@@ -2322,7 +2751,7 @@
     </w:p>
     <w:p>
       <w:pPr>
-        <w:outlineLvl w:val="1"/>
+        <w:jc w:val="center"/>
         <w:rPr>
           <w:rFonts w:cstheme="minorHAnsi"/>
           <w:sz w:val="28"/>
@@ -2335,16 +2764,6 @@
         <w:jc w:val="center"/>
         <w:rPr>
           <w:rFonts w:cstheme="minorHAnsi"/>
-          <w:sz w:val="28"/>
-          <w:szCs w:val="28"/>
-        </w:rPr>
-      </w:pPr>
-    </w:p>
-    <w:p>
-      <w:pPr>
-        <w:jc w:val="center"/>
-        <w:rPr>
-          <w:rFonts w:cstheme="minorHAnsi"/>
           <w:sz w:val="26"/>
           <w:szCs w:val="26"/>
         </w:rPr>
@@ -2355,8 +2774,19 @@
           <w:sz w:val="26"/>
           <w:szCs w:val="26"/>
         </w:rPr>
+        <w:lastRenderedPageBreak/>
         <w:t>References</w:t>
       </w:r>
+    </w:p>
+    <w:p>
+      <w:pPr>
+        <w:jc w:val="center"/>
+        <w:rPr>
+          <w:rFonts w:cstheme="minorHAnsi"/>
+          <w:sz w:val="26"/>
+          <w:szCs w:val="26"/>
+        </w:rPr>
+      </w:pPr>
     </w:p>
     <w:p>
       <w:pPr>
@@ -2400,7 +2830,7 @@
         </w:rPr>
         <w:t xml:space="preserve">. </w:t>
       </w:r>
-      <w:hyperlink r:id="rId11" w:tgtFrame="_blank" w:history="1">
+      <w:hyperlink r:id="rId12" w:tgtFrame="_blank" w:history="1">
         <w:r>
           <w:rPr>
             <w:rStyle w:val="text-box-trim-both"/>
@@ -2446,7 +2876,7 @@
         </w:rPr>
         <w:t xml:space="preserve">. </w:t>
       </w:r>
-      <w:hyperlink r:id="rId12" w:tgtFrame="_blank" w:history="1">
+      <w:hyperlink r:id="rId13" w:tgtFrame="_blank" w:history="1">
         <w:r>
           <w:rPr>
             <w:rStyle w:val="text-box-trim-both"/>
@@ -2486,7 +2916,7 @@
         </w:rPr>
         <w:t xml:space="preserve">. </w:t>
       </w:r>
-      <w:hyperlink r:id="rId13" w:tgtFrame="_blank" w:history="1">
+      <w:hyperlink r:id="rId14" w:tgtFrame="_blank" w:history="1">
         <w:r>
           <w:rPr>
             <w:rStyle w:val="text-box-trim-both"/>
@@ -2526,7 +2956,7 @@
         </w:rPr>
         <w:t xml:space="preserve"> [PDF]. </w:t>
       </w:r>
-      <w:hyperlink r:id="rId14" w:tgtFrame="_blank" w:history="1">
+      <w:hyperlink r:id="rId15" w:tgtFrame="_blank" w:history="1">
         <w:r>
           <w:rPr>
             <w:rStyle w:val="text-box-trim-both"/>
@@ -2566,7 +2996,7 @@
         </w:rPr>
         <w:t xml:space="preserve">. </w:t>
       </w:r>
-      <w:hyperlink r:id="rId15" w:tgtFrame="_blank" w:history="1">
+      <w:hyperlink r:id="rId16" w:tgtFrame="_blank" w:history="1">
         <w:r>
           <w:rPr>
             <w:rStyle w:val="text-box-trim-both"/>
@@ -3150,6 +3580,16 @@
       <w:u w:val="single"/>
     </w:rPr>
   </w:style>
+  <w:style w:type="paragraph" w:styleId="Revision">
+    <w:name w:val="Revision"/>
+    <w:hidden/>
+    <w:uiPriority w:val="99"/>
+    <w:semiHidden/>
+    <w:rsid w:val="00983347"/>
+    <w:rPr>
+      <w:rFonts w:ascii="Times New Roman" w:eastAsia="Times New Roman" w:hAnsi="Times New Roman" w:cs="Times New Roman"/>
+    </w:rPr>
+  </w:style>
 </w:styles>
 </file>
 
@@ -3446,4 +3886,16 @@
     </a:ext>
   </a:extLst>
 </a:theme>
+</file>
+
+<file path=customXml/item1.xml><?xml version="1.0" encoding="utf-8"?>
+<b:Sources xmlns:b="http://schemas.openxmlformats.org/officeDocument/2006/bibliography" xmlns="http://schemas.openxmlformats.org/officeDocument/2006/bibliography" SelectedStyle="/APASixthEditionOfficeOnline.xsl" StyleName="APA" Version="6"/>
+</file>
+
+<file path=customXml/itemProps1.xml><?xml version="1.0" encoding="utf-8"?>
+<ds:datastoreItem xmlns:ds="http://schemas.openxmlformats.org/officeDocument/2006/customXml" ds:itemID="{1C78A16A-608E-DA4E-AAE2-D1D2FEBCF9E2}">
+  <ds:schemaRefs>
+    <ds:schemaRef ds:uri="http://schemas.openxmlformats.org/officeDocument/2006/bibliography"/>
+  </ds:schemaRefs>
+</ds:datastoreItem>
 </file>
</xml_diff>